<commit_message>
Update QNC templates to latest versions
</commit_message>
<xml_diff>
--- a/assets/templates/qnc-idea-building-template.docx
+++ b/assets/templates/qnc-idea-building-template.docx
@@ -47,48 +47,6 @@
         </w:rPr>
         <w:t xml:space="preserve">Team Name: </w:t>
       </w:r>
-      <w:r>
-        <w:drawing>
-          <wp:anchor allowOverlap="1" behindDoc="0" distB="114300" distT="114300" distL="114300" distR="114300" hidden="0" layoutInCell="1" locked="0" relativeHeight="0" simplePos="0">
-            <wp:simplePos x="0" y="0"/>
-            <wp:positionH relativeFrom="column">
-              <wp:posOffset>4619625</wp:posOffset>
-            </wp:positionH>
-            <wp:positionV relativeFrom="paragraph">
-              <wp:posOffset>504825</wp:posOffset>
-            </wp:positionV>
-            <wp:extent cx="1319361" cy="938213"/>
-            <wp:effectExtent b="0" l="0" r="0" t="0"/>
-            <wp:wrapSquare wrapText="bothSides" distB="114300" distT="114300" distL="114300" distR="114300"/>
-            <wp:docPr id="1" name="image1.png"/>
-            <a:graphic>
-              <a:graphicData uri="http://schemas.openxmlformats.org/drawingml/2006/picture">
-                <pic:pic>
-                  <pic:nvPicPr>
-                    <pic:cNvPr id="0" name="image1.png"/>
-                    <pic:cNvPicPr preferRelativeResize="0"/>
-                  </pic:nvPicPr>
-                  <pic:blipFill>
-                    <a:blip r:embed="rId6"/>
-                    <a:srcRect b="0" l="0" r="0" t="0"/>
-                    <a:stretch>
-                      <a:fillRect/>
-                    </a:stretch>
-                  </pic:blipFill>
-                  <pic:spPr>
-                    <a:xfrm>
-                      <a:off x="0" y="0"/>
-                      <a:ext cx="1319361" cy="938213"/>
-                    </a:xfrm>
-                    <a:prstGeom prst="rect"/>
-                    <a:ln/>
-                  </pic:spPr>
-                </pic:pic>
-              </a:graphicData>
-            </a:graphic>
-          </wp:anchor>
-        </w:drawing>
-      </w:r>
     </w:p>
     <w:p>
       <w:pPr>
@@ -167,22 +125,28 @@
       </w:pPr>
       <w:r>
         <w:rPr>
-          <w:rFonts w:ascii="Arial Unicode MS" w:cs="Arial Unicode MS" w:eastAsia="Arial Unicode MS" w:hAnsi="Arial Unicode MS"/>
+          <w:rFonts w:ascii="Arimo" w:cs="Arimo" w:eastAsia="Arimo" w:hAnsi="Arimo"/>
           <w:sz w:val="34"/>
           <w:szCs w:val="34"/>
           <w:rtl w:val="0"/>
         </w:rPr>
         <w:t xml:space="preserve">How to Use This Sheet</w:t>
       </w:r>
+      <w:r>
+        <w:rPr>
+          <w:rtl w:val="0"/>
+        </w:rPr>
+      </w:r>
     </w:p>
     <w:p>
       <w:pPr>
         <w:numPr>
           <w:ilvl w:val="0"/>
-          <w:numId w:val="1"/>
+          <w:numId w:val="2"/>
         </w:numPr>
-        <w:spacing w:after="0" w:afterAutospacing="0" w:before="240" w:lineRule="auto"/>
+        <w:spacing w:after="0" w:before="240" w:lineRule="auto"/>
         <w:ind w:left="720" w:hanging="360"/>
+        <w:rPr/>
       </w:pPr>
       <w:r>
         <w:rPr>
@@ -195,10 +159,11 @@
       <w:pPr>
         <w:numPr>
           <w:ilvl w:val="0"/>
-          <w:numId w:val="1"/>
+          <w:numId w:val="2"/>
         </w:numPr>
-        <w:spacing w:after="0" w:afterAutospacing="0" w:before="0" w:beforeAutospacing="0" w:lineRule="auto"/>
+        <w:spacing w:after="0" w:before="0" w:lineRule="auto"/>
         <w:ind w:left="720" w:hanging="360"/>
+        <w:rPr/>
       </w:pPr>
       <w:r>
         <w:rPr>
@@ -211,10 +176,11 @@
       <w:pPr>
         <w:numPr>
           <w:ilvl w:val="0"/>
-          <w:numId w:val="1"/>
+          <w:numId w:val="2"/>
         </w:numPr>
-        <w:spacing w:after="0" w:afterAutospacing="0" w:before="0" w:beforeAutospacing="0" w:lineRule="auto"/>
+        <w:spacing w:after="0" w:before="0" w:lineRule="auto"/>
         <w:ind w:left="720" w:hanging="360"/>
+        <w:rPr/>
       </w:pPr>
       <w:r>
         <w:rPr>
@@ -227,26 +193,30 @@
       <w:pPr>
         <w:numPr>
           <w:ilvl w:val="0"/>
-          <w:numId w:val="1"/>
+          <w:numId w:val="2"/>
         </w:numPr>
-        <w:spacing w:after="0" w:afterAutospacing="0" w:before="0" w:beforeAutospacing="0" w:lineRule="auto"/>
+        <w:spacing w:after="0" w:before="0" w:lineRule="auto"/>
         <w:ind w:left="720" w:hanging="360"/>
-      </w:pPr>
-      <w:r>
-        <w:rPr>
-          <w:rtl w:val="0"/>
-        </w:rPr>
-        <w:t xml:space="preserve">Support claims with an observation, source, test result, or artifact. Label untested claims as “Assumption.”</w:t>
+        <w:rPr/>
+      </w:pPr>
+      <w:r>
+        <w:rPr>
+          <w:rtl w:val="0"/>
+        </w:rPr>
+        <w:t xml:space="preserve">Support claims with an observation, source, test result, or artifact.</w:t>
+        <w:br w:type="textWrapping"/>
+        <w:t xml:space="preserve">Label untested claims as “Assumption.”</w:t>
       </w:r>
     </w:p>
     <w:p>
       <w:pPr>
         <w:numPr>
           <w:ilvl w:val="0"/>
-          <w:numId w:val="1"/>
+          <w:numId w:val="2"/>
         </w:numPr>
-        <w:spacing w:after="0" w:afterAutospacing="0" w:before="0" w:beforeAutospacing="0" w:lineRule="auto"/>
+        <w:spacing w:after="0" w:before="0" w:lineRule="auto"/>
         <w:ind w:left="720" w:hanging="360"/>
+        <w:rPr/>
       </w:pPr>
       <w:r>
         <w:rPr>
@@ -259,10 +229,11 @@
       <w:pPr>
         <w:numPr>
           <w:ilvl w:val="0"/>
-          <w:numId w:val="1"/>
+          <w:numId w:val="2"/>
         </w:numPr>
-        <w:spacing w:after="0" w:afterAutospacing="0" w:before="0" w:beforeAutospacing="0" w:lineRule="auto"/>
+        <w:spacing w:after="0" w:before="0" w:lineRule="auto"/>
         <w:ind w:left="720" w:hanging="360"/>
+        <w:rPr/>
       </w:pPr>
       <w:r>
         <w:rPr>
@@ -275,10 +246,11 @@
       <w:pPr>
         <w:numPr>
           <w:ilvl w:val="0"/>
-          <w:numId w:val="1"/>
+          <w:numId w:val="2"/>
         </w:numPr>
-        <w:spacing w:after="0" w:afterAutospacing="0" w:before="0" w:beforeAutospacing="0" w:lineRule="auto"/>
+        <w:spacing w:after="0" w:before="0" w:lineRule="auto"/>
         <w:ind w:left="720" w:hanging="360"/>
+        <w:rPr/>
       </w:pPr>
       <w:r>
         <w:rPr>
@@ -291,10 +263,11 @@
       <w:pPr>
         <w:numPr>
           <w:ilvl w:val="0"/>
-          <w:numId w:val="1"/>
+          <w:numId w:val="2"/>
         </w:numPr>
-        <w:spacing w:after="240" w:before="0" w:beforeAutospacing="0" w:lineRule="auto"/>
+        <w:spacing w:after="240" w:before="0" w:lineRule="auto"/>
         <w:ind w:left="720" w:hanging="360"/>
+        <w:rPr/>
       </w:pPr>
       <w:r>
         <w:rPr>
@@ -335,10 +308,15 @@
           <w:between w:space="0" w:sz="0" w:val="nil"/>
         </w:pBdr>
         <w:shd w:fill="auto" w:val="clear"/>
-        <w:rPr/>
-      </w:pPr>
-      <w:r>
-        <w:rPr>
+        <w:rPr>
+          <w:sz w:val="36"/>
+          <w:szCs w:val="36"/>
+        </w:rPr>
+      </w:pPr>
+      <w:r>
+        <w:rPr>
+          <w:sz w:val="36"/>
+          <w:szCs w:val="36"/>
           <w:rtl w:val="0"/>
         </w:rPr>
         <w:t xml:space="preserve">1. Team Profile </w:t>
@@ -1080,328 +1058,6 @@
           </w:p>
         </w:tc>
       </w:tr>
-      <w:tr>
-        <w:trPr>
-          <w:cantSplit w:val="0"/>
-          <w:tblHeader w:val="0"/>
-        </w:trPr>
-        <w:tc>
-          <w:tcPr>
-            <w:shd w:fill="auto" w:val="clear"/>
-            <w:tcMar>
-              <w:top w:w="150.0" w:type="dxa"/>
-              <w:left w:w="150.0" w:type="dxa"/>
-              <w:bottom w:w="150.0" w:type="dxa"/>
-              <w:right w:w="150.0" w:type="dxa"/>
-            </w:tcMar>
-            <w:vAlign w:val="top"/>
-          </w:tcPr>
-          <w:p>
-            <w:pPr>
-              <w:pBdr>
-                <w:top w:space="0" w:sz="0" w:val="nil"/>
-                <w:left w:space="0" w:sz="0" w:val="nil"/>
-                <w:bottom w:space="0" w:sz="0" w:val="nil"/>
-                <w:right w:space="0" w:sz="0" w:val="nil"/>
-                <w:between w:space="0" w:sz="0" w:val="nil"/>
-              </w:pBdr>
-              <w:shd w:fill="auto" w:val="clear"/>
-              <w:spacing w:after="150" w:before="150" w:lineRule="auto"/>
-              <w:rPr/>
-            </w:pPr>
-            <w:r>
-              <w:rPr>
-                <w:rtl w:val="0"/>
-              </w:rPr>
-            </w:r>
-          </w:p>
-        </w:tc>
-        <w:tc>
-          <w:tcPr>
-            <w:shd w:fill="auto" w:val="clear"/>
-            <w:tcMar>
-              <w:top w:w="150.0" w:type="dxa"/>
-              <w:left w:w="150.0" w:type="dxa"/>
-              <w:bottom w:w="150.0" w:type="dxa"/>
-              <w:right w:w="150.0" w:type="dxa"/>
-            </w:tcMar>
-            <w:vAlign w:val="top"/>
-          </w:tcPr>
-          <w:p>
-            <w:pPr>
-              <w:pBdr>
-                <w:top w:space="0" w:sz="0" w:val="nil"/>
-                <w:left w:space="0" w:sz="0" w:val="nil"/>
-                <w:bottom w:space="0" w:sz="0" w:val="nil"/>
-                <w:right w:space="0" w:sz="0" w:val="nil"/>
-                <w:between w:space="0" w:sz="0" w:val="nil"/>
-              </w:pBdr>
-              <w:shd w:fill="auto" w:val="clear"/>
-              <w:spacing w:after="150" w:before="150" w:lineRule="auto"/>
-              <w:rPr/>
-            </w:pPr>
-            <w:r>
-              <w:rPr>
-                <w:rtl w:val="0"/>
-              </w:rPr>
-            </w:r>
-          </w:p>
-        </w:tc>
-        <w:tc>
-          <w:tcPr>
-            <w:shd w:fill="auto" w:val="clear"/>
-            <w:tcMar>
-              <w:top w:w="150.0" w:type="dxa"/>
-              <w:left w:w="150.0" w:type="dxa"/>
-              <w:bottom w:w="150.0" w:type="dxa"/>
-              <w:right w:w="150.0" w:type="dxa"/>
-            </w:tcMar>
-            <w:vAlign w:val="top"/>
-          </w:tcPr>
-          <w:p>
-            <w:pPr>
-              <w:pBdr>
-                <w:top w:space="0" w:sz="0" w:val="nil"/>
-                <w:left w:space="0" w:sz="0" w:val="nil"/>
-                <w:bottom w:space="0" w:sz="0" w:val="nil"/>
-                <w:right w:space="0" w:sz="0" w:val="nil"/>
-                <w:between w:space="0" w:sz="0" w:val="nil"/>
-              </w:pBdr>
-              <w:shd w:fill="auto" w:val="clear"/>
-              <w:spacing w:after="150" w:before="150" w:lineRule="auto"/>
-              <w:rPr/>
-            </w:pPr>
-            <w:r>
-              <w:rPr>
-                <w:rtl w:val="0"/>
-              </w:rPr>
-            </w:r>
-          </w:p>
-        </w:tc>
-        <w:tc>
-          <w:tcPr>
-            <w:shd w:fill="auto" w:val="clear"/>
-            <w:tcMar>
-              <w:top w:w="150.0" w:type="dxa"/>
-              <w:left w:w="150.0" w:type="dxa"/>
-              <w:bottom w:w="150.0" w:type="dxa"/>
-              <w:right w:w="150.0" w:type="dxa"/>
-            </w:tcMar>
-            <w:vAlign w:val="top"/>
-          </w:tcPr>
-          <w:p>
-            <w:pPr>
-              <w:pBdr>
-                <w:top w:space="0" w:sz="0" w:val="nil"/>
-                <w:left w:space="0" w:sz="0" w:val="nil"/>
-                <w:bottom w:space="0" w:sz="0" w:val="nil"/>
-                <w:right w:space="0" w:sz="0" w:val="nil"/>
-                <w:between w:space="0" w:sz="0" w:val="nil"/>
-              </w:pBdr>
-              <w:shd w:fill="auto" w:val="clear"/>
-              <w:spacing w:after="150" w:before="150" w:lineRule="auto"/>
-              <w:rPr/>
-            </w:pPr>
-            <w:r>
-              <w:rPr>
-                <w:rtl w:val="0"/>
-              </w:rPr>
-            </w:r>
-          </w:p>
-        </w:tc>
-        <w:tc>
-          <w:tcPr>
-            <w:shd w:fill="auto" w:val="clear"/>
-            <w:tcMar>
-              <w:top w:w="150.0" w:type="dxa"/>
-              <w:left w:w="150.0" w:type="dxa"/>
-              <w:bottom w:w="150.0" w:type="dxa"/>
-              <w:right w:w="150.0" w:type="dxa"/>
-            </w:tcMar>
-            <w:vAlign w:val="top"/>
-          </w:tcPr>
-          <w:p>
-            <w:pPr>
-              <w:pBdr>
-                <w:top w:space="0" w:sz="0" w:val="nil"/>
-                <w:left w:space="0" w:sz="0" w:val="nil"/>
-                <w:bottom w:space="0" w:sz="0" w:val="nil"/>
-                <w:right w:space="0" w:sz="0" w:val="nil"/>
-                <w:between w:space="0" w:sz="0" w:val="nil"/>
-              </w:pBdr>
-              <w:shd w:fill="auto" w:val="clear"/>
-              <w:spacing w:after="150" w:before="150" w:lineRule="auto"/>
-              <w:rPr/>
-            </w:pPr>
-            <w:r>
-              <w:rPr>
-                <w:rtl w:val="0"/>
-              </w:rPr>
-            </w:r>
-          </w:p>
-        </w:tc>
-      </w:tr>
-      <w:tr>
-        <w:trPr>
-          <w:cantSplit w:val="0"/>
-          <w:tblHeader w:val="0"/>
-        </w:trPr>
-        <w:tc>
-          <w:tcPr>
-            <w:shd w:fill="auto" w:val="clear"/>
-            <w:tcMar>
-              <w:top w:w="150.0" w:type="dxa"/>
-              <w:left w:w="150.0" w:type="dxa"/>
-              <w:bottom w:w="150.0" w:type="dxa"/>
-              <w:right w:w="150.0" w:type="dxa"/>
-            </w:tcMar>
-            <w:vAlign w:val="top"/>
-          </w:tcPr>
-          <w:p>
-            <w:pPr>
-              <w:pBdr>
-                <w:top w:space="0" w:sz="0" w:val="nil"/>
-                <w:left w:space="0" w:sz="0" w:val="nil"/>
-                <w:bottom w:space="0" w:sz="0" w:val="nil"/>
-                <w:right w:space="0" w:sz="0" w:val="nil"/>
-                <w:between w:space="0" w:sz="0" w:val="nil"/>
-              </w:pBdr>
-              <w:shd w:fill="auto" w:val="clear"/>
-              <w:spacing w:after="150" w:before="150" w:lineRule="auto"/>
-              <w:rPr/>
-            </w:pPr>
-            <w:r>
-              <w:rPr>
-                <w:rtl w:val="0"/>
-              </w:rPr>
-            </w:r>
-          </w:p>
-        </w:tc>
-        <w:tc>
-          <w:tcPr>
-            <w:shd w:fill="auto" w:val="clear"/>
-            <w:tcMar>
-              <w:top w:w="150.0" w:type="dxa"/>
-              <w:left w:w="150.0" w:type="dxa"/>
-              <w:bottom w:w="150.0" w:type="dxa"/>
-              <w:right w:w="150.0" w:type="dxa"/>
-            </w:tcMar>
-            <w:vAlign w:val="top"/>
-          </w:tcPr>
-          <w:p>
-            <w:pPr>
-              <w:pBdr>
-                <w:top w:space="0" w:sz="0" w:val="nil"/>
-                <w:left w:space="0" w:sz="0" w:val="nil"/>
-                <w:bottom w:space="0" w:sz="0" w:val="nil"/>
-                <w:right w:space="0" w:sz="0" w:val="nil"/>
-                <w:between w:space="0" w:sz="0" w:val="nil"/>
-              </w:pBdr>
-              <w:shd w:fill="auto" w:val="clear"/>
-              <w:spacing w:after="150" w:before="150" w:lineRule="auto"/>
-              <w:rPr/>
-            </w:pPr>
-            <w:r>
-              <w:rPr>
-                <w:rtl w:val="0"/>
-              </w:rPr>
-            </w:r>
-          </w:p>
-        </w:tc>
-        <w:tc>
-          <w:tcPr>
-            <w:shd w:fill="auto" w:val="clear"/>
-            <w:tcMar>
-              <w:top w:w="150.0" w:type="dxa"/>
-              <w:left w:w="150.0" w:type="dxa"/>
-              <w:bottom w:w="150.0" w:type="dxa"/>
-              <w:right w:w="150.0" w:type="dxa"/>
-            </w:tcMar>
-            <w:vAlign w:val="top"/>
-          </w:tcPr>
-          <w:p>
-            <w:pPr>
-              <w:pBdr>
-                <w:top w:space="0" w:sz="0" w:val="nil"/>
-                <w:left w:space="0" w:sz="0" w:val="nil"/>
-                <w:bottom w:space="0" w:sz="0" w:val="nil"/>
-                <w:right w:space="0" w:sz="0" w:val="nil"/>
-                <w:between w:space="0" w:sz="0" w:val="nil"/>
-              </w:pBdr>
-              <w:shd w:fill="auto" w:val="clear"/>
-              <w:spacing w:after="150" w:before="150" w:lineRule="auto"/>
-              <w:rPr/>
-            </w:pPr>
-            <w:r>
-              <w:rPr>
-                <w:rtl w:val="0"/>
-              </w:rPr>
-            </w:r>
-          </w:p>
-        </w:tc>
-        <w:tc>
-          <w:tcPr>
-            <w:shd w:fill="auto" w:val="clear"/>
-            <w:tcMar>
-              <w:top w:w="150.0" w:type="dxa"/>
-              <w:left w:w="150.0" w:type="dxa"/>
-              <w:bottom w:w="150.0" w:type="dxa"/>
-              <w:right w:w="150.0" w:type="dxa"/>
-            </w:tcMar>
-            <w:vAlign w:val="top"/>
-          </w:tcPr>
-          <w:p>
-            <w:pPr>
-              <w:pBdr>
-                <w:top w:space="0" w:sz="0" w:val="nil"/>
-                <w:left w:space="0" w:sz="0" w:val="nil"/>
-                <w:bottom w:space="0" w:sz="0" w:val="nil"/>
-                <w:right w:space="0" w:sz="0" w:val="nil"/>
-                <w:between w:space="0" w:sz="0" w:val="nil"/>
-              </w:pBdr>
-              <w:shd w:fill="auto" w:val="clear"/>
-              <w:spacing w:after="150" w:before="150" w:lineRule="auto"/>
-              <w:rPr/>
-            </w:pPr>
-            <w:r>
-              <w:rPr>
-                <w:rtl w:val="0"/>
-              </w:rPr>
-            </w:r>
-          </w:p>
-        </w:tc>
-        <w:tc>
-          <w:tcPr>
-            <w:shd w:fill="auto" w:val="clear"/>
-            <w:tcMar>
-              <w:top w:w="150.0" w:type="dxa"/>
-              <w:left w:w="150.0" w:type="dxa"/>
-              <w:bottom w:w="150.0" w:type="dxa"/>
-              <w:right w:w="150.0" w:type="dxa"/>
-            </w:tcMar>
-            <w:vAlign w:val="top"/>
-          </w:tcPr>
-          <w:p>
-            <w:pPr>
-              <w:pBdr>
-                <w:top w:space="0" w:sz="0" w:val="nil"/>
-                <w:left w:space="0" w:sz="0" w:val="nil"/>
-                <w:bottom w:space="0" w:sz="0" w:val="nil"/>
-                <w:right w:space="0" w:sz="0" w:val="nil"/>
-                <w:between w:space="0" w:sz="0" w:val="nil"/>
-              </w:pBdr>
-              <w:shd w:fill="auto" w:val="clear"/>
-              <w:spacing w:after="150" w:before="150" w:lineRule="auto"/>
-              <w:rPr/>
-            </w:pPr>
-            <w:r>
-              <w:rPr>
-                <w:rtl w:val="0"/>
-              </w:rPr>
-            </w:r>
-          </w:p>
-        </w:tc>
-      </w:tr>
     </w:tbl>
     <w:p>
       <w:pPr>
@@ -1414,7 +1070,7 @@
           <w:szCs w:val="22"/>
         </w:rPr>
       </w:pPr>
-      <w:bookmarkStart w:colFirst="0" w:colLast="0" w:name="_f1p10wadsup" w:id="0"/>
+      <w:bookmarkStart w:colFirst="0" w:colLast="0" w:name="_heading=h.6u0abdt0639n" w:id="0"/>
       <w:bookmarkEnd w:id="0"/>
       <w:r>
         <w:rPr>
@@ -1446,7 +1102,7 @@
       <w:pPr>
         <w:numPr>
           <w:ilvl w:val="0"/>
-          <w:numId w:val="2"/>
+          <w:numId w:val="3"/>
         </w:numPr>
         <w:pBdr>
           <w:top w:space="0" w:sz="0" w:val="nil"/>
@@ -1457,6 +1113,7 @@
         </w:pBdr>
         <w:shd w:fill="auto" w:val="clear"/>
         <w:ind w:left="600" w:hanging="360"/>
+        <w:rPr/>
       </w:pPr>
       <w:r>
         <w:rPr>
@@ -1468,17 +1125,30 @@
       </w:r>
       <w:r>
         <w:rPr>
-          <w:rFonts w:ascii="Arial Unicode MS" w:cs="Arial Unicode MS" w:eastAsia="Arial Unicode MS" w:hAnsi="Arial Unicode MS"/>
-          <w:rtl w:val="0"/>
-        </w:rPr>
-        <w:t xml:space="preserve"> (working title)</w:t>
+          <w:rFonts w:ascii="Arimo" w:cs="Arimo" w:eastAsia="Arimo" w:hAnsi="Arimo"/>
+          <w:rtl w:val="0"/>
+        </w:rPr>
+        <w:t xml:space="preserve"> </w:t>
+      </w:r>
+      <w:r>
+        <w:rPr>
+          <w:rFonts w:ascii="Arimo" w:cs="Arimo" w:eastAsia="Arimo" w:hAnsi="Arimo"/>
+          <w:rtl w:val="0"/>
+        </w:rPr>
+        <w:t xml:space="preserve">(working title)</w:t>
+        <w:br w:type="textWrapping"/>
+      </w:r>
+      <w:r>
+        <w:rPr>
+          <w:rtl w:val="0"/>
+        </w:rPr>
       </w:r>
     </w:p>
     <w:p>
       <w:pPr>
         <w:numPr>
           <w:ilvl w:val="0"/>
-          <w:numId w:val="2"/>
+          <w:numId w:val="3"/>
         </w:numPr>
         <w:pBdr>
           <w:top w:space="0" w:sz="0" w:val="nil"/>
@@ -1489,6 +1159,7 @@
         </w:pBdr>
         <w:shd w:fill="auto" w:val="clear"/>
         <w:ind w:left="600" w:hanging="360"/>
+        <w:rPr/>
       </w:pPr>
       <w:r>
         <w:rPr>
@@ -1500,17 +1171,43 @@
       </w:r>
       <w:r>
         <w:rPr>
-          <w:rFonts w:ascii="Arial Unicode MS" w:cs="Arial Unicode MS" w:eastAsia="Arial Unicode MS" w:hAnsi="Arial Unicode MS"/>
-          <w:rtl w:val="0"/>
-        </w:rPr>
-        <w:t xml:space="preserve"> In one sentence, describe your solution — e.g. “An AI service that helps [target user] solve [problem] by [how it works].”</w:t>
+          <w:rFonts w:ascii="Arimo" w:cs="Arimo" w:eastAsia="Arimo" w:hAnsi="Arimo"/>
+          <w:rtl w:val="0"/>
+        </w:rPr>
+        <w:t xml:space="preserve"> In one sentence, describe your solution </w:t>
+        <w:br w:type="textWrapping"/>
+        <w:tab/>
+        <w:tab/>
+        <w:t xml:space="preserve">— </w:t>
+      </w:r>
+      <w:r>
+        <w:rPr>
+          <w:rFonts w:ascii="Arimo" w:cs="Arimo" w:eastAsia="Arimo" w:hAnsi="Arimo"/>
+          <w:rtl w:val="0"/>
+        </w:rPr>
+        <w:t xml:space="preserve">e.g.</w:t>
+      </w:r>
+      <w:r>
+        <w:rPr>
+          <w:rFonts w:ascii="Arimo" w:cs="Arimo" w:eastAsia="Arimo" w:hAnsi="Arimo"/>
+          <w:i w:val="1"/>
+          <w:iCs w:val="1"/>
+          <w:rtl w:val="0"/>
+        </w:rPr>
+        <w:t xml:space="preserve"> “An AI service that helps [target user] solve [problem] by [how it works].”</w:t>
+        <w:br w:type="textWrapping"/>
+      </w:r>
+      <w:r>
+        <w:rPr>
+          <w:rtl w:val="0"/>
+        </w:rPr>
       </w:r>
     </w:p>
     <w:p>
       <w:pPr>
         <w:numPr>
           <w:ilvl w:val="0"/>
-          <w:numId w:val="2"/>
+          <w:numId w:val="3"/>
         </w:numPr>
         <w:pBdr>
           <w:top w:space="0" w:sz="0" w:val="nil"/>
@@ -1521,6 +1218,7 @@
         </w:pBdr>
         <w:shd w:fill="auto" w:val="clear"/>
         <w:ind w:left="600" w:hanging="360"/>
+        <w:rPr/>
       </w:pPr>
       <w:r>
         <w:rPr>
@@ -1535,6 +1233,24 @@
           <w:rtl w:val="0"/>
         </w:rPr>
         <w:t xml:space="preserve"> (ex: LLM, Computer Vision, TTS, recommendation algorithm…)</w:t>
+      </w:r>
+    </w:p>
+    <w:p>
+      <w:pPr>
+        <w:pBdr>
+          <w:top w:space="0" w:sz="0" w:val="nil"/>
+          <w:left w:space="0" w:sz="0" w:val="nil"/>
+          <w:bottom w:space="0" w:sz="0" w:val="nil"/>
+          <w:right w:space="0" w:sz="0" w:val="nil"/>
+          <w:between w:space="0" w:sz="0" w:val="nil"/>
+        </w:pBdr>
+        <w:shd w:fill="auto" w:val="clear"/>
+        <w:rPr/>
+      </w:pPr>
+      <w:r>
+        <w:rPr>
+          <w:rtl w:val="0"/>
+        </w:rPr>
       </w:r>
     </w:p>
     <w:p>
@@ -1577,27 +1293,30 @@
           <w:rtl w:val="0"/>
         </w:rPr>
         <w:t xml:space="preserve">3.1. Pain Point</w:t>
-      </w:r>
-    </w:p>
-    <w:p>
-      <w:pPr>
-        <w:pBdr>
-          <w:top w:space="0" w:sz="0" w:val="nil"/>
-          <w:left w:space="0" w:sz="0" w:val="nil"/>
-          <w:bottom w:space="0" w:sz="0" w:val="nil"/>
-          <w:right w:space="0" w:sz="0" w:val="nil"/>
-          <w:between w:space="0" w:sz="0" w:val="nil"/>
-        </w:pBdr>
-        <w:shd w:fill="auto" w:val="clear"/>
-        <w:spacing w:after="240" w:lineRule="auto"/>
-        <w:rPr/>
-      </w:pPr>
-      <w:r>
-        <w:rPr>
-          <w:rFonts w:ascii="Arial Unicode MS" w:cs="Arial Unicode MS" w:eastAsia="Arial Unicode MS" w:hAnsi="Arial Unicode MS"/>
+        <w:br w:type="textWrapping"/>
+      </w:r>
+      <w:r>
+        <w:rPr>
+          <w:rFonts w:ascii="Arimo" w:cs="Arimo" w:eastAsia="Arimo" w:hAnsi="Arimo"/>
+          <w:b w:val="0"/>
+          <w:bCs w:val="0"/>
+          <w:sz w:val="22"/>
+          <w:szCs w:val="22"/>
           <w:rtl w:val="0"/>
         </w:rPr>
         <w:t xml:space="preserve">Describe the specific pain points or limitations users currently face with existing markets or services.</w:t>
+      </w:r>
+      <w:r>
+        <w:rPr>
+          <w:rFonts w:ascii="Arimo" w:cs="Arimo" w:eastAsia="Arimo" w:hAnsi="Arimo"/>
+          <w:rtl w:val="0"/>
+        </w:rPr>
+        <w:br w:type="textWrapping"/>
+      </w:r>
+      <w:r>
+        <w:rPr>
+          <w:rtl w:val="0"/>
+        </w:rPr>
       </w:r>
     </w:p>
     <w:p>
@@ -1632,11 +1351,13 @@
         </w:pBdr>
         <w:shd w:fill="auto" w:val="clear"/>
         <w:spacing w:after="225" w:lineRule="auto"/>
-        <w:rPr/>
-      </w:pPr>
-      <w:r>
-        <w:rPr>
-          <w:rFonts w:ascii="Arial Unicode MS" w:cs="Arial Unicode MS" w:eastAsia="Arial Unicode MS" w:hAnsi="Arial Unicode MS"/>
+        <w:rPr>
+          <w:rFonts w:ascii="Arimo" w:cs="Arimo" w:eastAsia="Arimo" w:hAnsi="Arimo"/>
+        </w:rPr>
+      </w:pPr>
+      <w:r>
+        <w:rPr>
+          <w:rFonts w:ascii="Arimo" w:cs="Arimo" w:eastAsia="Arimo" w:hAnsi="Arimo"/>
           <w:rtl w:val="0"/>
         </w:rPr>
         <w:t xml:space="preserve">What is the ultimate goal you want to achieve through this project?</w:t>
@@ -1654,14 +1375,41 @@
         </w:pBdr>
         <w:shd w:fill="auto" w:val="clear"/>
         <w:spacing w:before="0" w:lineRule="auto"/>
+        <w:rPr>
+          <w:rFonts w:ascii="Arimo" w:cs="Arimo" w:eastAsia="Arimo" w:hAnsi="Arimo"/>
+        </w:rPr>
+      </w:pPr>
+      <w:r>
+        <w:rPr>
+          <w:rtl w:val="0"/>
+        </w:rPr>
+      </w:r>
+    </w:p>
+    <w:p>
+      <w:pPr>
+        <w:pStyle w:val="Heading2"/>
+        <w:pBdr>
+          <w:top w:space="0" w:sz="0" w:val="nil"/>
+          <w:left w:space="0" w:sz="0" w:val="nil"/>
+          <w:bottom w:space="0" w:sz="0" w:val="nil"/>
+          <w:right w:space="0" w:sz="0" w:val="nil"/>
+          <w:between w:space="0" w:sz="0" w:val="nil"/>
+        </w:pBdr>
+        <w:shd w:fill="auto" w:val="clear"/>
+        <w:spacing w:before="0" w:lineRule="auto"/>
         <w:rPr/>
       </w:pPr>
       <w:r>
         <w:rPr>
-          <w:rFonts w:ascii="Arial Unicode MS" w:cs="Arial Unicode MS" w:eastAsia="Arial Unicode MS" w:hAnsi="Arial Unicode MS"/>
+          <w:rFonts w:ascii="Arimo" w:cs="Arimo" w:eastAsia="Arimo" w:hAnsi="Arimo"/>
           <w:rtl w:val="0"/>
         </w:rPr>
         <w:t xml:space="preserve">4. Expected Impact &amp; Differentiation (Value Proposition)</w:t>
+      </w:r>
+      <w:r>
+        <w:rPr>
+          <w:rtl w:val="0"/>
+        </w:rPr>
       </w:r>
     </w:p>
     <w:p>
@@ -1679,10 +1427,11 @@
         </w:pBdr>
         <w:shd w:fill="auto" w:val="clear"/>
         <w:ind w:left="600" w:hanging="360"/>
-      </w:pPr>
-      <w:r>
-        <w:rPr>
-          <w:rFonts w:ascii="Arial Unicode MS" w:cs="Arial Unicode MS" w:eastAsia="Arial Unicode MS" w:hAnsi="Arial Unicode MS"/>
+        <w:rPr/>
+      </w:pPr>
+      <w:r>
+        <w:rPr>
+          <w:rFonts w:ascii="Arimo" w:cs="Arimo" w:eastAsia="Arimo" w:hAnsi="Arimo"/>
           <w:b w:val="1"/>
           <w:bCs w:val="1"/>
           <w:rtl w:val="0"/>
@@ -1691,10 +1440,34 @@
       </w:r>
       <w:r>
         <w:rPr>
-          <w:rFonts w:ascii="Arial Unicode MS" w:cs="Arial Unicode MS" w:eastAsia="Arial Unicode MS" w:hAnsi="Arial Unicode MS"/>
-          <w:rtl w:val="0"/>
-        </w:rPr>
-        <w:t xml:space="preserve"> What is your team's unique approach to using AI compared to existing similar services?</w:t>
+          <w:rFonts w:ascii="Arimo" w:cs="Arimo" w:eastAsia="Arimo" w:hAnsi="Arimo"/>
+          <w:rtl w:val="0"/>
+        </w:rPr>
+        <w:t xml:space="preserve"> What is your team's unique approach to using AI </w:t>
+        <w:br w:type="textWrapping"/>
+        <w:t xml:space="preserve">compared to existing similar services? </w:t>
+      </w:r>
+      <w:r>
+        <w:rPr>
+          <w:rFonts w:ascii="Arimo" w:cs="Arimo" w:eastAsia="Arimo" w:hAnsi="Arimo"/>
+          <w:i w:val="1"/>
+          <w:iCs w:val="1"/>
+          <w:rtl w:val="0"/>
+        </w:rPr>
+        <w:t xml:space="preserve">(If your team does not use AI for the project, please write down the difference between existing similar solutions)</w:t>
+      </w:r>
+      <w:r>
+        <w:rPr>
+          <w:rFonts w:ascii="Arimo" w:cs="Arimo" w:eastAsia="Arimo" w:hAnsi="Arimo"/>
+          <w:rtl w:val="0"/>
+        </w:rPr>
+        <w:t xml:space="preserve"> </w:t>
+        <w:br w:type="textWrapping"/>
+      </w:r>
+      <w:r>
+        <w:rPr>
+          <w:rtl w:val="0"/>
+        </w:rPr>
       </w:r>
     </w:p>
     <w:p>
@@ -1712,10 +1485,11 @@
         </w:pBdr>
         <w:shd w:fill="auto" w:val="clear"/>
         <w:ind w:left="600" w:hanging="360"/>
-      </w:pPr>
-      <w:r>
-        <w:rPr>
-          <w:rFonts w:ascii="Arial Unicode MS" w:cs="Arial Unicode MS" w:eastAsia="Arial Unicode MS" w:hAnsi="Arial Unicode MS"/>
+        <w:rPr/>
+      </w:pPr>
+      <w:r>
+        <w:rPr>
+          <w:rFonts w:ascii="Arimo" w:cs="Arimo" w:eastAsia="Arimo" w:hAnsi="Arimo"/>
           <w:b w:val="1"/>
           <w:bCs w:val="1"/>
           <w:rtl w:val="0"/>
@@ -1724,10 +1498,247 @@
       </w:r>
       <w:r>
         <w:rPr>
-          <w:rFonts w:ascii="Arial Unicode MS" w:cs="Arial Unicode MS" w:eastAsia="Arial Unicode MS" w:hAnsi="Arial Unicode MS"/>
+          <w:rFonts w:ascii="Arimo" w:cs="Arimo" w:eastAsia="Arimo" w:hAnsi="Arimo"/>
           <w:rtl w:val="0"/>
         </w:rPr>
         <w:t xml:space="preserve"> What positive changes would emerge if this service were widely adopted?</w:t>
+      </w:r>
+    </w:p>
+    <w:p>
+      <w:pPr>
+        <w:pBdr>
+          <w:top w:space="0" w:sz="0" w:val="nil"/>
+          <w:left w:space="0" w:sz="0" w:val="nil"/>
+          <w:bottom w:space="0" w:sz="0" w:val="nil"/>
+          <w:right w:space="0" w:sz="0" w:val="nil"/>
+          <w:between w:space="0" w:sz="0" w:val="nil"/>
+        </w:pBdr>
+        <w:shd w:fill="auto" w:val="clear"/>
+        <w:rPr>
+          <w:rFonts w:ascii="Arimo" w:cs="Arimo" w:eastAsia="Arimo" w:hAnsi="Arimo"/>
+        </w:rPr>
+      </w:pPr>
+      <w:r>
+        <w:rPr>
+          <w:rtl w:val="0"/>
+        </w:rPr>
+      </w:r>
+    </w:p>
+    <w:p>
+      <w:pPr>
+        <w:pBdr>
+          <w:top w:space="0" w:sz="0" w:val="nil"/>
+          <w:left w:space="0" w:sz="0" w:val="nil"/>
+          <w:bottom w:space="0" w:sz="0" w:val="nil"/>
+          <w:right w:space="0" w:sz="0" w:val="nil"/>
+          <w:between w:space="0" w:sz="0" w:val="nil"/>
+        </w:pBdr>
+        <w:shd w:fill="auto" w:val="clear"/>
+        <w:rPr>
+          <w:rFonts w:ascii="Arimo" w:cs="Arimo" w:eastAsia="Arimo" w:hAnsi="Arimo"/>
+        </w:rPr>
+      </w:pPr>
+      <w:r>
+        <w:rPr>
+          <w:rtl w:val="0"/>
+        </w:rPr>
+      </w:r>
+    </w:p>
+    <w:p>
+      <w:pPr>
+        <w:pStyle w:val="Heading2"/>
+        <w:spacing w:after="180" w:before="0" w:lineRule="auto"/>
+        <w:rPr/>
+      </w:pPr>
+      <w:r>
+        <w:rPr>
+          <w:rtl w:val="0"/>
+        </w:rPr>
+        <w:t xml:space="preserve">5. Funding / Support Request</w:t>
+      </w:r>
+    </w:p>
+    <w:sdt>
+      <w:sdtPr>
+        <w:id w:val="-1829787180"/>
+        <w:tag w:val="goog_rdk_0"/>
+      </w:sdtPr>
+      <w:sdtContent>
+        <w:p>
+          <w:pPr>
+            <w:pStyle w:val="Heading2"/>
+            <w:spacing w:after="180" w:before="0" w:lineRule="auto"/>
+            <w:rPr>
+              <w:b w:val="0"/>
+              <w:bCs w:val="0"/>
+              <w:sz w:val="22"/>
+              <w:szCs w:val="22"/>
+            </w:rPr>
+          </w:pPr>
+          <w:r>
+            <w:rPr>
+              <w:b w:val="0"/>
+              <w:bCs w:val="0"/>
+              <w:sz w:val="22"/>
+              <w:szCs w:val="22"/>
+              <w:rtl w:val="0"/>
+            </w:rPr>
+            <w:t xml:space="preserve">Financial support is not provided by default. Depending on what your team submits here, the club may decide to provide funding on a case-by-case basis.</w:t>
+          </w:r>
+        </w:p>
+      </w:sdtContent>
+    </w:sdt>
+    <w:sdt>
+      <w:sdtPr>
+        <w:id w:val="-993639153"/>
+        <w:tag w:val="goog_rdk_1"/>
+      </w:sdtPr>
+      <w:sdtContent>
+        <w:p>
+          <w:pPr>
+            <w:pStyle w:val="Heading2"/>
+            <w:numPr>
+              <w:ilvl w:val="0"/>
+              <w:numId w:val="1"/>
+            </w:numPr>
+            <w:spacing w:after="0" w:afterAutospacing="0" w:before="240" w:lineRule="auto"/>
+            <w:ind w:left="720" w:hanging="360"/>
+            <w:rPr>
+              <w:b w:val="0"/>
+              <w:bCs w:val="0"/>
+              <w:sz w:val="22"/>
+              <w:szCs w:val="22"/>
+            </w:rPr>
+          </w:pPr>
+          <w:r>
+            <w:rPr>
+              <w:b w:val="0"/>
+              <w:bCs w:val="0"/>
+              <w:sz w:val="22"/>
+              <w:szCs w:val="22"/>
+              <w:rtl w:val="0"/>
+            </w:rPr>
+            <w:t xml:space="preserve">Support Needed?: Yes / No </w:t>
+            <w:br w:type="textWrapping"/>
+            <w:tab/>
+            <w:t xml:space="preserve">— does your plan require funding to move forward?</w:t>
+          </w:r>
+        </w:p>
+      </w:sdtContent>
+    </w:sdt>
+    <w:sdt>
+      <w:sdtPr>
+        <w:id w:val="316234762"/>
+        <w:tag w:val="goog_rdk_2"/>
+      </w:sdtPr>
+      <w:sdtContent>
+        <w:p>
+          <w:pPr>
+            <w:pStyle w:val="Heading2"/>
+            <w:numPr>
+              <w:ilvl w:val="0"/>
+              <w:numId w:val="1"/>
+            </w:numPr>
+            <w:spacing w:after="0" w:afterAutospacing="0" w:before="0" w:beforeAutospacing="0" w:lineRule="auto"/>
+            <w:ind w:left="720" w:hanging="360"/>
+            <w:rPr>
+              <w:b w:val="0"/>
+              <w:bCs w:val="0"/>
+              <w:sz w:val="22"/>
+              <w:szCs w:val="22"/>
+            </w:rPr>
+          </w:pPr>
+          <w:r>
+            <w:rPr>
+              <w:b w:val="0"/>
+              <w:bCs w:val="0"/>
+              <w:sz w:val="22"/>
+              <w:szCs w:val="22"/>
+              <w:rtl w:val="0"/>
+            </w:rPr>
+            <w:t xml:space="preserve">What For: e.g., cloud/API credits, hardware, materials, competition or venue fees, etc.</w:t>
+          </w:r>
+        </w:p>
+      </w:sdtContent>
+    </w:sdt>
+    <w:sdt>
+      <w:sdtPr>
+        <w:id w:val="1380436275"/>
+        <w:tag w:val="goog_rdk_3"/>
+      </w:sdtPr>
+      <w:sdtContent>
+        <w:p>
+          <w:pPr>
+            <w:pStyle w:val="Heading2"/>
+            <w:numPr>
+              <w:ilvl w:val="0"/>
+              <w:numId w:val="1"/>
+            </w:numPr>
+            <w:spacing w:after="0" w:afterAutospacing="0" w:before="0" w:beforeAutospacing="0" w:lineRule="auto"/>
+            <w:ind w:left="720" w:hanging="360"/>
+            <w:rPr>
+              <w:b w:val="0"/>
+              <w:bCs w:val="0"/>
+              <w:sz w:val="22"/>
+              <w:szCs w:val="22"/>
+            </w:rPr>
+          </w:pPr>
+          <w:r>
+            <w:rPr>
+              <w:b w:val="0"/>
+              <w:bCs w:val="0"/>
+              <w:sz w:val="22"/>
+              <w:szCs w:val="22"/>
+              <w:rtl w:val="0"/>
+            </w:rPr>
+            <w:t xml:space="preserve">Estimated Amount: </w:t>
+          </w:r>
+        </w:p>
+      </w:sdtContent>
+    </w:sdt>
+    <w:sdt>
+      <w:sdtPr>
+        <w:id w:val="1742846635"/>
+        <w:tag w:val="goog_rdk_4"/>
+      </w:sdtPr>
+      <w:sdtContent>
+        <w:p>
+          <w:pPr>
+            <w:pStyle w:val="Heading2"/>
+            <w:numPr>
+              <w:ilvl w:val="0"/>
+              <w:numId w:val="1"/>
+            </w:numPr>
+            <w:spacing w:after="240" w:before="0" w:beforeAutospacing="0" w:lineRule="auto"/>
+            <w:ind w:left="720" w:hanging="360"/>
+            <w:rPr>
+              <w:b w:val="0"/>
+              <w:bCs w:val="0"/>
+              <w:sz w:val="22"/>
+              <w:szCs w:val="22"/>
+            </w:rPr>
+          </w:pPr>
+          <w:r>
+            <w:rPr>
+              <w:b w:val="0"/>
+              <w:bCs w:val="0"/>
+              <w:sz w:val="22"/>
+              <w:szCs w:val="22"/>
+              <w:rtl w:val="0"/>
+            </w:rPr>
+            <w:t xml:space="preserve">Justification: Why this is necessary for the project's success, and what the impact would be without it.</w:t>
+          </w:r>
+        </w:p>
+      </w:sdtContent>
+    </w:sdt>
+    <w:p>
+      <w:pPr>
+        <w:ind w:left="0" w:firstLine="0"/>
+        <w:rPr/>
+      </w:pPr>
+      <w:r>
+        <w:rPr>
+          <w:rtl w:val="0"/>
+        </w:rPr>
       </w:r>
     </w:p>
     <w:p>
@@ -1741,15 +1752,13 @@
           <w:between w:space="0" w:sz="0" w:val="nil"/>
         </w:pBdr>
         <w:shd w:fill="auto" w:val="clear"/>
-        <w:spacing w:after="240" w:lineRule="auto"/>
         <w:rPr/>
       </w:pPr>
       <w:r>
         <w:rPr>
-          <w:rFonts w:ascii="Arial Unicode MS" w:cs="Arial Unicode MS" w:eastAsia="Arial Unicode MS" w:hAnsi="Arial Unicode MS"/>
-          <w:rtl w:val="0"/>
-        </w:rPr>
-        <w:t xml:space="preserve">5. Funding / Support Request</w:t>
+          <w:rtl w:val="0"/>
+        </w:rPr>
+        <w:t xml:space="preserve">6. Notes for Brainstorming</w:t>
       </w:r>
     </w:p>
     <w:p>
@@ -1767,186 +1776,22 @@
       </w:pPr>
       <w:r>
         <w:rPr>
-          <w:rFonts w:ascii="Arial Unicode MS" w:cs="Arial Unicode MS" w:eastAsia="Arial Unicode MS" w:hAnsi="Arial Unicode MS"/>
-          <w:rtl w:val="0"/>
-        </w:rPr>
-        <w:t xml:space="preserve">Financial support is not provided by default. Depending on what your team submits here, the club may decide to provide funding on a case-by-case basis.</w:t>
-      </w:r>
-    </w:p>
-    <w:p>
-      <w:pPr>
-        <w:numPr>
-          <w:ilvl w:val="0"/>
-          <w:numId w:val="4"/>
-        </w:numPr>
-        <w:pBdr>
-          <w:top w:space="0" w:sz="0" w:val="nil"/>
-          <w:left w:space="0" w:sz="0" w:val="nil"/>
-          <w:bottom w:space="0" w:sz="0" w:val="nil"/>
-          <w:right w:space="0" w:sz="0" w:val="nil"/>
-          <w:between w:space="0" w:sz="0" w:val="nil"/>
-        </w:pBdr>
-        <w:shd w:fill="auto" w:val="clear"/>
-        <w:ind w:left="600" w:hanging="360"/>
-      </w:pPr>
-      <w:r>
-        <w:rPr>
-          <w:rFonts w:ascii="Arial Unicode MS" w:cs="Arial Unicode MS" w:eastAsia="Arial Unicode MS" w:hAnsi="Arial Unicode MS"/>
-          <w:b w:val="1"/>
-          <w:bCs w:val="1"/>
-          <w:rtl w:val="0"/>
-        </w:rPr>
-        <w:t xml:space="preserve">Support Needed?:</w:t>
-      </w:r>
-      <w:r>
-        <w:rPr>
-          <w:rFonts w:ascii="Arial Unicode MS" w:cs="Arial Unicode MS" w:eastAsia="Arial Unicode MS" w:hAnsi="Arial Unicode MS"/>
-          <w:rtl w:val="0"/>
-        </w:rPr>
-        <w:t xml:space="preserve"> Yes / No — does your plan require funding to move forward?</w:t>
-      </w:r>
-    </w:p>
-    <w:p>
-      <w:pPr>
-        <w:numPr>
-          <w:ilvl w:val="0"/>
-          <w:numId w:val="4"/>
-        </w:numPr>
-        <w:pBdr>
-          <w:top w:space="0" w:sz="0" w:val="nil"/>
-          <w:left w:space="0" w:sz="0" w:val="nil"/>
-          <w:bottom w:space="0" w:sz="0" w:val="nil"/>
-          <w:right w:space="0" w:sz="0" w:val="nil"/>
-          <w:between w:space="0" w:sz="0" w:val="nil"/>
-        </w:pBdr>
-        <w:shd w:fill="auto" w:val="clear"/>
-        <w:ind w:left="600" w:hanging="360"/>
-      </w:pPr>
-      <w:r>
-        <w:rPr>
-          <w:rFonts w:ascii="Arial Unicode MS" w:cs="Arial Unicode MS" w:eastAsia="Arial Unicode MS" w:hAnsi="Arial Unicode MS"/>
-          <w:b w:val="1"/>
-          <w:bCs w:val="1"/>
-          <w:rtl w:val="0"/>
-        </w:rPr>
-        <w:t xml:space="preserve">What For:</w:t>
-      </w:r>
-      <w:r>
-        <w:rPr>
-          <w:rFonts w:ascii="Arial Unicode MS" w:cs="Arial Unicode MS" w:eastAsia="Arial Unicode MS" w:hAnsi="Arial Unicode MS"/>
-          <w:rtl w:val="0"/>
-        </w:rPr>
-        <w:t xml:space="preserve"> e.g., cloud/API credits, hardware, materials, competition or venue fees, etc.</w:t>
-      </w:r>
-    </w:p>
-    <w:p>
-      <w:pPr>
-        <w:numPr>
-          <w:ilvl w:val="0"/>
-          <w:numId w:val="4"/>
-        </w:numPr>
-        <w:pBdr>
-          <w:top w:space="0" w:sz="0" w:val="nil"/>
-          <w:left w:space="0" w:sz="0" w:val="nil"/>
-          <w:bottom w:space="0" w:sz="0" w:val="nil"/>
-          <w:right w:space="0" w:sz="0" w:val="nil"/>
-          <w:between w:space="0" w:sz="0" w:val="nil"/>
-        </w:pBdr>
-        <w:shd w:fill="auto" w:val="clear"/>
-        <w:ind w:left="600" w:hanging="360"/>
-      </w:pPr>
-      <w:r>
-        <w:rPr>
-          <w:rFonts w:ascii="Arial Unicode MS" w:cs="Arial Unicode MS" w:eastAsia="Arial Unicode MS" w:hAnsi="Arial Unicode MS"/>
-          <w:b w:val="1"/>
-          <w:bCs w:val="1"/>
-          <w:rtl w:val="0"/>
-        </w:rPr>
-        <w:t xml:space="preserve">Estimated Amount:</w:t>
-      </w:r>
-      <w:r>
-        <w:rPr>
-          <w:rFonts w:ascii="Arial Unicode MS" w:cs="Arial Unicode MS" w:eastAsia="Arial Unicode MS" w:hAnsi="Arial Unicode MS"/>
-          <w:rtl w:val="0"/>
-        </w:rPr>
-        <w:t xml:space="preserve"> </w:t>
-      </w:r>
-    </w:p>
-    <w:p>
-      <w:pPr>
-        <w:numPr>
-          <w:ilvl w:val="0"/>
-          <w:numId w:val="4"/>
-        </w:numPr>
-        <w:pBdr>
-          <w:top w:space="0" w:sz="0" w:val="nil"/>
-          <w:left w:space="0" w:sz="0" w:val="nil"/>
-          <w:bottom w:space="0" w:sz="0" w:val="nil"/>
-          <w:right w:space="0" w:sz="0" w:val="nil"/>
-          <w:between w:space="0" w:sz="0" w:val="nil"/>
-        </w:pBdr>
-        <w:shd w:fill="auto" w:val="clear"/>
-        <w:ind w:left="600" w:hanging="360"/>
-      </w:pPr>
-      <w:r>
-        <w:rPr>
-          <w:rFonts w:ascii="Arial Unicode MS" w:cs="Arial Unicode MS" w:eastAsia="Arial Unicode MS" w:hAnsi="Arial Unicode MS"/>
-          <w:b w:val="1"/>
-          <w:bCs w:val="1"/>
-          <w:rtl w:val="0"/>
-        </w:rPr>
-        <w:t xml:space="preserve">Justification:</w:t>
-      </w:r>
-      <w:r>
-        <w:rPr>
-          <w:rFonts w:ascii="Arial Unicode MS" w:cs="Arial Unicode MS" w:eastAsia="Arial Unicode MS" w:hAnsi="Arial Unicode MS"/>
-          <w:rtl w:val="0"/>
-        </w:rPr>
-        <w:t xml:space="preserve"> Why this is necessary for the project's success, and what the impact would be without it.</w:t>
-      </w:r>
-    </w:p>
-    <w:p>
-      <w:pPr>
-        <w:pStyle w:val="Heading2"/>
-        <w:pBdr>
-          <w:top w:space="0" w:sz="0" w:val="nil"/>
-          <w:left w:space="0" w:sz="0" w:val="nil"/>
-          <w:bottom w:space="0" w:sz="0" w:val="nil"/>
-          <w:right w:space="0" w:sz="0" w:val="nil"/>
-          <w:between w:space="0" w:sz="0" w:val="nil"/>
-        </w:pBdr>
-        <w:shd w:fill="auto" w:val="clear"/>
-        <w:rPr/>
-      </w:pPr>
-      <w:r>
-        <w:rPr>
-          <w:rtl w:val="0"/>
-        </w:rPr>
-        <w:t xml:space="preserve">6. Notes for Brainstorming</w:t>
-      </w:r>
-    </w:p>
-    <w:p>
-      <w:pPr>
-        <w:pBdr>
-          <w:top w:space="0" w:sz="0" w:val="nil"/>
-          <w:left w:space="0" w:sz="0" w:val="nil"/>
-          <w:bottom w:space="0" w:sz="0" w:val="nil"/>
-          <w:right w:space="0" w:sz="0" w:val="nil"/>
-          <w:between w:space="0" w:sz="0" w:val="nil"/>
-        </w:pBdr>
-        <w:shd w:fill="auto" w:val="clear"/>
-        <w:spacing w:after="240" w:lineRule="auto"/>
-        <w:rPr/>
-      </w:pPr>
-      <w:r>
-        <w:rPr>
-          <w:rFonts w:ascii="Arial Unicode MS" w:cs="Arial Unicode MS" w:eastAsia="Arial Unicode MS" w:hAnsi="Arial Unicode MS"/>
-          <w:rtl w:val="0"/>
-        </w:rPr>
-        <w:t xml:space="preserve">(Use this space for open brainstorming — sketches, references, or notes that don’t fit elsewhere.)</w:t>
+          <w:rFonts w:ascii="Arimo" w:cs="Arimo" w:eastAsia="Arimo" w:hAnsi="Arimo"/>
+          <w:rtl w:val="0"/>
+        </w:rPr>
+        <w:t xml:space="preserve">(Use this space for open brainstorming </w:t>
+        <w:br w:type="textWrapping"/>
+        <w:tab/>
+        <w:t xml:space="preserve">— sketches, references, or notes that don’t fit elsewhere.)</w:t>
+      </w:r>
+      <w:r>
+        <w:rPr>
+          <w:rtl w:val="0"/>
+        </w:rPr>
       </w:r>
     </w:p>
     <w:sectPr>
+      <w:headerReference r:id="rId7" w:type="default"/>
       <w:pgSz w:h="15840" w:w="12240" w:orient="portrait"/>
       <w:pgMar w:bottom="1440" w:top="1440" w:left="1440" w:right="1440" w:header="0" w:footer="720"/>
       <w:pgNumType w:start="1"/>
@@ -1955,6 +1800,64 @@
 </w:document>
 </file>
 
+<file path=word/header1.xml><?xml version="1.0" encoding="utf-8"?>
+<w:hdr xmlns:mc="http://schemas.openxmlformats.org/markup-compatibility/2006" xmlns:o="urn:schemas-microsoft-com:office:office" xmlns:r="http://schemas.openxmlformats.org/officeDocument/2006/relationships" xmlns:m="http://schemas.openxmlformats.org/officeDocument/2006/math" xmlns:v="urn:schemas-microsoft-com:vml" xmlns:wp="http://schemas.openxmlformats.org/drawingml/2006/wordprocessingDrawing" xmlns:w10="urn:schemas-microsoft-com:office:word" xmlns:w="http://schemas.openxmlformats.org/wordprocessingml/2006/main" xmlns:wne="http://schemas.microsoft.com/office/word/2006/wordml" xmlns:sl="http://schemas.openxmlformats.org/schemaLibrary/2006/main" xmlns:a="http://schemas.openxmlformats.org/drawingml/2006/main" xmlns:pic="http://schemas.openxmlformats.org/drawingml/2006/picture" xmlns:c="http://schemas.openxmlformats.org/drawingml/2006/chart" xmlns:lc="http://schemas.openxmlformats.org/drawingml/2006/lockedCanvas" xmlns:dgm="http://schemas.openxmlformats.org/drawingml/2006/diagram" xmlns:wps="http://schemas.microsoft.com/office/word/2010/wordprocessingShape" xmlns:wpg="http://schemas.microsoft.com/office/word/2010/wordprocessingGroup" xmlns:w14="http://schemas.microsoft.com/office/word/2010/wordml" xmlns:w15="http://schemas.microsoft.com/office/word/2012/wordml" xmlns:w16="http://schemas.microsoft.com/office/word/2018/wordml" xmlns:w16cex="http://schemas.microsoft.com/office/word/2018/wordml/cex" xmlns:w16cid="http://schemas.microsoft.com/office/word/2016/wordml/cid" xmlns="http://schemas.microsoft.com/office/tasks/2019/documenttasks" xmlns:cr="http://schemas.microsoft.com/office/comments/2020/reactions">
+  <w:p>
+    <w:pPr>
+      <w:ind w:left="7920" w:firstLine="720"/>
+      <w:rPr/>
+    </w:pPr>
+    <w:r>
+      <w:rPr>
+        <w:rtl w:val="0"/>
+      </w:rPr>
+    </w:r>
+    <w:r>
+      <w:drawing>
+        <wp:anchor allowOverlap="1" behindDoc="1" distB="114300" distT="114300" distL="114300" distR="114300" hidden="0" layoutInCell="1" locked="0" relativeHeight="0" simplePos="0">
+          <wp:simplePos x="0" y="0"/>
+          <wp:positionH relativeFrom="column">
+            <wp:posOffset>5505450</wp:posOffset>
+          </wp:positionH>
+          <wp:positionV relativeFrom="paragraph">
+            <wp:posOffset>114300</wp:posOffset>
+          </wp:positionV>
+          <wp:extent cx="1290638" cy="931504"/>
+          <wp:effectExtent b="0" l="0" r="0" t="0"/>
+          <wp:wrapNone/>
+          <wp:docPr id="2" name="image1.png"/>
+          <a:graphic>
+            <a:graphicData uri="http://schemas.openxmlformats.org/drawingml/2006/picture">
+              <pic:pic>
+                <pic:nvPicPr>
+                  <pic:cNvPr id="0" name="image1.png"/>
+                  <pic:cNvPicPr preferRelativeResize="0"/>
+                </pic:nvPicPr>
+                <pic:blipFill>
+                  <a:blip r:embed="rId1"/>
+                  <a:srcRect b="0" l="0" r="0" t="0"/>
+                  <a:stretch>
+                    <a:fillRect/>
+                  </a:stretch>
+                </pic:blipFill>
+                <pic:spPr>
+                  <a:xfrm>
+                    <a:off x="0" y="0"/>
+                    <a:ext cx="1290638" cy="931504"/>
+                  </a:xfrm>
+                  <a:prstGeom prst="rect"/>
+                  <a:ln/>
+                </pic:spPr>
+              </pic:pic>
+            </a:graphicData>
+          </a:graphic>
+        </wp:anchor>
+      </w:drawing>
+    </w:r>
+  </w:p>
+</w:hdr>
+</file>
+
 <file path=word/numbering.xml><?xml version="1.0" encoding="utf-8"?>
 <w:numbering xmlns:mc="http://schemas.openxmlformats.org/markup-compatibility/2006" xmlns:o="urn:schemas-microsoft-com:office:office" xmlns:r="http://schemas.openxmlformats.org/officeDocument/2006/relationships" xmlns:m="http://schemas.openxmlformats.org/officeDocument/2006/math" xmlns:v="urn:schemas-microsoft-com:vml" xmlns:wp="http://schemas.openxmlformats.org/drawingml/2006/wordprocessingDrawing" xmlns:w10="urn:schemas-microsoft-com:office:word" xmlns:w="http://schemas.openxmlformats.org/wordprocessingml/2006/main" xmlns:wne="http://schemas.microsoft.com/office/word/2006/wordml" xmlns:sl="http://schemas.openxmlformats.org/schemaLibrary/2006/main" xmlns:a="http://schemas.openxmlformats.org/drawingml/2006/main" xmlns:pic="http://schemas.openxmlformats.org/drawingml/2006/picture" xmlns:c="http://schemas.openxmlformats.org/drawingml/2006/chart" xmlns:lc="http://schemas.openxmlformats.org/drawingml/2006/lockedCanvas" xmlns:dgm="http://schemas.openxmlformats.org/drawingml/2006/diagram" xmlns:wps="http://schemas.microsoft.com/office/word/2010/wordprocessingShape" xmlns:wpg="http://schemas.microsoft.com/office/word/2010/wordprocessingGroup" xmlns:w14="http://schemas.microsoft.com/office/word/2010/wordml" xmlns:w15="http://schemas.microsoft.com/office/word/2012/wordml" xmlns:w16="http://schemas.microsoft.com/office/word/2018/wordml" xmlns:w16cex="http://schemas.microsoft.com/office/word/2018/wordml/cex" xmlns:w16cid="http://schemas.microsoft.com/office/word/2016/wordml/cid" xmlns="http://schemas.microsoft.com/office/tasks/2019/documenttasks" xmlns:cr="http://schemas.microsoft.com/office/comments/2020/reactions">
   <w:abstractNum w:abstractNumId="1">
@@ -2074,22 +1977,10 @@
       <w:lvlText w:val="●"/>
       <w:lvlJc w:val="left"/>
       <w:pPr>
-        <w:ind w:left="600" w:hanging="360"/>
-      </w:pPr>
-      <w:rPr>
-        <w:rFonts w:ascii="Arial" w:cs="Arial" w:eastAsia="Arial" w:hAnsi="Arial"/>
-        <w:b w:val="0"/>
-        <w:bCs w:val="0"/>
-        <w:i w:val="0"/>
-        <w:iCs w:val="0"/>
-        <w:smallCaps w:val="0"/>
-        <w:strike w:val="0"/>
-        <w:color w:val="000000"/>
-        <w:sz w:val="22"/>
-        <w:szCs w:val="22"/>
-        <w:u w:val="none"/>
-        <w:shd w:fill="auto" w:val="clear"/>
-        <w:vertAlign w:val="baseline"/>
+        <w:ind w:left="720" w:hanging="360"/>
+      </w:pPr>
+      <w:rPr>
+        <w:u w:val="none"/>
       </w:rPr>
     </w:lvl>
     <w:lvl w:ilvl="1">
@@ -2101,19 +1992,7 @@
         <w:ind w:left="1440" w:hanging="360"/>
       </w:pPr>
       <w:rPr>
-        <w:rFonts w:ascii="Arial" w:cs="Arial" w:eastAsia="Arial" w:hAnsi="Arial"/>
-        <w:b w:val="0"/>
-        <w:bCs w:val="0"/>
-        <w:i w:val="0"/>
-        <w:iCs w:val="0"/>
-        <w:smallCaps w:val="0"/>
-        <w:strike w:val="0"/>
-        <w:color w:val="000000"/>
-        <w:sz w:val="22"/>
-        <w:szCs w:val="22"/>
-        <w:u w:val="none"/>
-        <w:shd w:fill="auto" w:val="clear"/>
-        <w:vertAlign w:val="baseline"/>
+        <w:u w:val="none"/>
       </w:rPr>
     </w:lvl>
     <w:lvl w:ilvl="2">
@@ -2125,171 +2004,87 @@
         <w:ind w:left="2160" w:hanging="360"/>
       </w:pPr>
       <w:rPr>
-        <w:rFonts w:ascii="Arial" w:cs="Arial" w:eastAsia="Arial" w:hAnsi="Arial"/>
-        <w:b w:val="0"/>
-        <w:bCs w:val="0"/>
-        <w:i w:val="0"/>
-        <w:iCs w:val="0"/>
-        <w:smallCaps w:val="0"/>
-        <w:strike w:val="0"/>
-        <w:color w:val="000000"/>
-        <w:sz w:val="22"/>
-        <w:szCs w:val="22"/>
-        <w:u w:val="none"/>
-        <w:shd w:fill="auto" w:val="clear"/>
-        <w:vertAlign w:val="baseline"/>
+        <w:u w:val="none"/>
       </w:rPr>
     </w:lvl>
     <w:lvl w:ilvl="3">
       <w:start w:val="1"/>
       <w:numFmt w:val="bullet"/>
+      <w:lvlText w:val="●"/>
+      <w:lvlJc w:val="left"/>
+      <w:pPr>
+        <w:ind w:left="2880" w:hanging="360"/>
+      </w:pPr>
+      <w:rPr>
+        <w:u w:val="none"/>
+      </w:rPr>
+    </w:lvl>
+    <w:lvl w:ilvl="4">
+      <w:start w:val="1"/>
+      <w:numFmt w:val="bullet"/>
+      <w:lvlText w:val="○"/>
+      <w:lvlJc w:val="left"/>
+      <w:pPr>
+        <w:ind w:left="3600" w:hanging="360"/>
+      </w:pPr>
+      <w:rPr>
+        <w:u w:val="none"/>
+      </w:rPr>
+    </w:lvl>
+    <w:lvl w:ilvl="5">
+      <w:start w:val="1"/>
+      <w:numFmt w:val="bullet"/>
       <w:lvlText w:val="■"/>
       <w:lvlJc w:val="left"/>
       <w:pPr>
-        <w:ind w:left="2880" w:hanging="360"/>
-      </w:pPr>
-      <w:rPr>
-        <w:rFonts w:ascii="Arial" w:cs="Arial" w:eastAsia="Arial" w:hAnsi="Arial"/>
-        <w:b w:val="0"/>
-        <w:bCs w:val="0"/>
-        <w:i w:val="0"/>
-        <w:iCs w:val="0"/>
-        <w:smallCaps w:val="0"/>
-        <w:strike w:val="0"/>
-        <w:color w:val="000000"/>
-        <w:sz w:val="22"/>
-        <w:szCs w:val="22"/>
-        <w:u w:val="none"/>
-        <w:shd w:fill="auto" w:val="clear"/>
-        <w:vertAlign w:val="baseline"/>
-      </w:rPr>
-    </w:lvl>
-    <w:lvl w:ilvl="4">
+        <w:ind w:left="4320" w:hanging="360"/>
+      </w:pPr>
+      <w:rPr>
+        <w:u w:val="none"/>
+      </w:rPr>
+    </w:lvl>
+    <w:lvl w:ilvl="6">
+      <w:start w:val="1"/>
+      <w:numFmt w:val="bullet"/>
+      <w:lvlText w:val="●"/>
+      <w:lvlJc w:val="left"/>
+      <w:pPr>
+        <w:ind w:left="5040" w:hanging="360"/>
+      </w:pPr>
+      <w:rPr>
+        <w:u w:val="none"/>
+      </w:rPr>
+    </w:lvl>
+    <w:lvl w:ilvl="7">
+      <w:start w:val="1"/>
+      <w:numFmt w:val="bullet"/>
+      <w:lvlText w:val="○"/>
+      <w:lvlJc w:val="left"/>
+      <w:pPr>
+        <w:ind w:left="5760" w:hanging="360"/>
+      </w:pPr>
+      <w:rPr>
+        <w:u w:val="none"/>
+      </w:rPr>
+    </w:lvl>
+    <w:lvl w:ilvl="8">
       <w:start w:val="1"/>
       <w:numFmt w:val="bullet"/>
       <w:lvlText w:val="■"/>
       <w:lvlJc w:val="left"/>
       <w:pPr>
-        <w:ind w:left="3600" w:hanging="360"/>
-      </w:pPr>
-      <w:rPr>
-        <w:rFonts w:ascii="Arial" w:cs="Arial" w:eastAsia="Arial" w:hAnsi="Arial"/>
-        <w:b w:val="0"/>
-        <w:bCs w:val="0"/>
-        <w:i w:val="0"/>
-        <w:iCs w:val="0"/>
-        <w:smallCaps w:val="0"/>
-        <w:strike w:val="0"/>
-        <w:color w:val="000000"/>
-        <w:sz w:val="22"/>
-        <w:szCs w:val="22"/>
-        <w:u w:val="none"/>
-        <w:shd w:fill="auto" w:val="clear"/>
-        <w:vertAlign w:val="baseline"/>
-      </w:rPr>
-    </w:lvl>
-    <w:lvl w:ilvl="5">
-      <w:start w:val="1"/>
-      <w:numFmt w:val="bullet"/>
-      <w:lvlText w:val="■"/>
-      <w:lvlJc w:val="left"/>
-      <w:pPr>
-        <w:ind w:left="4320" w:hanging="360"/>
-      </w:pPr>
-      <w:rPr>
-        <w:rFonts w:ascii="Arial" w:cs="Arial" w:eastAsia="Arial" w:hAnsi="Arial"/>
-        <w:b w:val="0"/>
-        <w:bCs w:val="0"/>
-        <w:i w:val="0"/>
-        <w:iCs w:val="0"/>
-        <w:smallCaps w:val="0"/>
-        <w:strike w:val="0"/>
-        <w:color w:val="000000"/>
-        <w:sz w:val="22"/>
-        <w:szCs w:val="22"/>
-        <w:u w:val="none"/>
-        <w:shd w:fill="auto" w:val="clear"/>
-        <w:vertAlign w:val="baseline"/>
-      </w:rPr>
-    </w:lvl>
-    <w:lvl w:ilvl="6">
-      <w:start w:val="1"/>
-      <w:numFmt w:val="bullet"/>
-      <w:lvlText w:val="■"/>
-      <w:lvlJc w:val="left"/>
-      <w:pPr>
-        <w:ind w:left="5040" w:hanging="360"/>
-      </w:pPr>
-      <w:rPr>
-        <w:rFonts w:ascii="Arial" w:cs="Arial" w:eastAsia="Arial" w:hAnsi="Arial"/>
-        <w:b w:val="0"/>
-        <w:bCs w:val="0"/>
-        <w:i w:val="0"/>
-        <w:iCs w:val="0"/>
-        <w:smallCaps w:val="0"/>
-        <w:strike w:val="0"/>
-        <w:color w:val="000000"/>
-        <w:sz w:val="22"/>
-        <w:szCs w:val="22"/>
-        <w:u w:val="none"/>
-        <w:shd w:fill="auto" w:val="clear"/>
-        <w:vertAlign w:val="baseline"/>
-      </w:rPr>
-    </w:lvl>
-    <w:lvl w:ilvl="7">
-      <w:start w:val="1"/>
-      <w:numFmt w:val="bullet"/>
-      <w:lvlText w:val="■"/>
-      <w:lvlJc w:val="left"/>
-      <w:pPr>
-        <w:ind w:left="5760" w:hanging="360"/>
-      </w:pPr>
-      <w:rPr>
-        <w:rFonts w:ascii="Arial" w:cs="Arial" w:eastAsia="Arial" w:hAnsi="Arial"/>
-        <w:b w:val="0"/>
-        <w:bCs w:val="0"/>
-        <w:i w:val="0"/>
-        <w:iCs w:val="0"/>
-        <w:smallCaps w:val="0"/>
-        <w:strike w:val="0"/>
-        <w:color w:val="000000"/>
-        <w:sz w:val="22"/>
-        <w:szCs w:val="22"/>
-        <w:u w:val="none"/>
-        <w:shd w:fill="auto" w:val="clear"/>
-        <w:vertAlign w:val="baseline"/>
-      </w:rPr>
-    </w:lvl>
-    <w:lvl w:ilvl="8">
-      <w:start w:val="1"/>
-      <w:numFmt w:val="bullet"/>
-      <w:lvlText w:val="■"/>
-      <w:lvlJc w:val="left"/>
-      <w:pPr>
         <w:ind w:left="6480" w:hanging="360"/>
       </w:pPr>
       <w:rPr>
-        <w:rFonts w:ascii="Arial" w:cs="Arial" w:eastAsia="Arial" w:hAnsi="Arial"/>
-        <w:b w:val="0"/>
-        <w:bCs w:val="0"/>
-        <w:i w:val="0"/>
-        <w:iCs w:val="0"/>
-        <w:smallCaps w:val="0"/>
-        <w:strike w:val="0"/>
-        <w:color w:val="000000"/>
-        <w:sz w:val="22"/>
-        <w:szCs w:val="22"/>
-        <w:u w:val="none"/>
-        <w:shd w:fill="auto" w:val="clear"/>
-        <w:vertAlign w:val="baseline"/>
+        <w:u w:val="none"/>
       </w:rPr>
     </w:lvl>
   </w:abstractNum>
   <w:abstractNum w:abstractNumId="3">
     <w:lvl w:ilvl="0">
       <w:start w:val="1"/>
-      <w:numFmt w:val="decimal"/>
-      <w:lvlText w:val="%1."/>
+      <w:numFmt w:val="bullet"/>
+      <w:lvlText w:val="●"/>
       <w:lvlJc w:val="left"/>
       <w:pPr>
         <w:ind w:left="600" w:hanging="360"/>
@@ -2927,24 +2722,19 @@
       <w:szCs w:val="72"/>
     </w:rPr>
   </w:style>
-  <w:style w:type="paragraph" w:styleId="Subtitle">
-    <w:name w:val="Subtitle"/>
-    <w:basedOn w:val="Normal"/>
-    <w:next w:val="Normal"/>
-    <w:pPr>
-      <w:keepNext w:val="1"/>
-      <w:keepLines w:val="1"/>
-      <w:pageBreakBefore w:val="0"/>
-      <w:spacing w:after="80" w:before="360" w:lineRule="auto"/>
-    </w:pPr>
-    <w:rPr>
-      <w:rFonts w:ascii="Georgia" w:cs="Georgia" w:eastAsia="Georgia" w:hAnsi="Georgia"/>
-      <w:i w:val="1"/>
-      <w:iCs w:val="1"/>
-      <w:color w:val="666666"/>
-      <w:sz w:val="48"/>
-      <w:szCs w:val="48"/>
-    </w:rPr>
+  <w:style w:type="table" w:styleId="TableNormal" w:default="1">
+    <w:name w:val="TableNormal"/>
+    <w:tblPr>
+      <w:tblCellMar>
+        <w:top w:w="100.0" w:type="dxa"/>
+        <w:left w:w="100.0" w:type="dxa"/>
+        <w:bottom w:w="100.0" w:type="dxa"/>
+        <w:right w:w="100.0" w:type="dxa"/>
+      </w:tblCellMar>
+    </w:tblPr>
+  </w:style>
+  <w:style w:type="paragraph" w:styleId="Normal" w:default="1">
+    <w:name w:val="normal"/>
   </w:style>
   <w:style w:type="table" w:styleId="Table1">
     <w:basedOn w:val="TableNormal"/>
@@ -2998,6 +2788,32 @@
       <w:tblStyleRowBandSize w:val="1"/>
       <w:tblStyleColBandSize w:val="1"/>
       <w:tblCellMar/>
+    </w:tblPr>
+  </w:style>
+  <w:style w:type="paragraph" w:styleId="Subtitle">
+    <w:name w:val="Subtitle"/>
+    <w:basedOn w:val="Normal"/>
+    <w:next w:val="Normal"/>
+    <w:pPr>
+      <w:keepNext w:val="1"/>
+      <w:keepLines w:val="1"/>
+      <w:pageBreakBefore w:val="0"/>
+      <w:spacing w:after="80" w:before="360" w:lineRule="auto"/>
+    </w:pPr>
+    <w:rPr>
+      <w:rFonts w:ascii="Georgia" w:cs="Georgia" w:eastAsia="Georgia" w:hAnsi="Georgia"/>
+      <w:i w:val="1"/>
+      <w:iCs w:val="1"/>
+      <w:color w:val="666666"/>
+      <w:sz w:val="48"/>
+      <w:szCs w:val="48"/>
+    </w:rPr>
+  </w:style>
+  <w:style w:type="table" w:styleId="Table1">
+    <w:basedOn w:val="TableNormal"/>
+    <w:tblPr>
+      <w:tblStyleRowBandSize w:val="1"/>
+      <w:tblStyleColBandSize w:val="1"/>
     </w:tblPr>
   </w:style>
 </w:styles>
@@ -3321,4 +3137,19 @@
   </a:objectDefaults>
   <a:extraClrSchemeLst/>
 </a:theme>
+</file>
+
+<file path=customXML/item1.xml><?xml version="1.0" encoding="utf-8"?>
+<go:gDocsCustomXmlDataStorage xmlns:go="http://customooxmlschemas.google.com/" xmlns:r="http://schemas.openxmlformats.org/officeDocument/2006/relationships" uri="GoogleDocsCustomDataVersion2">
+  <go:docsCustomData xmlns:go="http://customooxmlschemas.google.com/" roundtripDataSignature="AMtx7mgQaStzvo/DJn5qRola7phSu7cQtQ==">CgMxLjAaDQoBMBIICgYIBTICCAEaDQoBMRIICgYIBTICCAEaDQoBMhIICgYIBTICCAEaDQoBMxIICgYIBTICCAEaDQoBNBIICgYIBTICCAEyDmguNnUwYWJkdDA2MzluOAByITE1WXpWWlFSWjAyREJaUEZ6NkszTnplTGswRm1QWHh4dw==</go:docsCustomData>
+</go:gDocsCustomXmlDataStorage>
+</file>
+
+<file path=customXML/itemProps1.xml><?xml version="1.0" encoding="utf-8"?>
+<ds:datastoreItem xmlns:ds="http://schemas.openxmlformats.org/officeDocument/2006/customXml" ds:itemID="{11111111-1234-1234-1234-123412341234}">
+  <ds:schemaRefs>
+    <ds:schemaRef ds:uri="http://schemas.openxmlformats.org/officeDocument/2006/relationships"/>
+    <ds:schemaRef ds:uri="http://customooxmlschemas.google.com/"/>
+  </ds:schemaRefs>
+</ds:datastoreItem>
 </file>
</xml_diff>